<commit_message>
updated syntax and created empty weight buildup fxn
</commit_message>
<xml_diff>
--- a/MATLAB Naming Syntax.docx
+++ b/MATLAB Naming Syntax.docx
@@ -34,8 +34,13 @@
       <w:r>
         <w:t>Figure “</w:t>
       </w:r>
-      <w:r>
-        <w:t>LineWidth” should be 1.75 unless that’s too cluttered, then lower it</w:t>
+      <w:proofErr w:type="spellStart"/>
+      <w:r>
+        <w:t>LineWidth</w:t>
+      </w:r>
+      <w:proofErr w:type="spellEnd"/>
+      <w:r>
+        <w:t>” should be 1.75 unless that’s too cluttered, then lower it</w:t>
       </w:r>
     </w:p>
     <w:p>
@@ -44,6 +49,7 @@
       </w:pPr>
     </w:p>
     <w:p>
+      <w:proofErr w:type="spellStart"/>
       <w:r>
         <w:rPr>
           <w:b/>
@@ -52,6 +58,7 @@
         </w:rPr>
         <w:t>aircraft.wing</w:t>
       </w:r>
+      <w:proofErr w:type="spellEnd"/>
       <w:r>
         <w:t xml:space="preserve"> </w:t>
       </w:r>
@@ -82,11 +89,16 @@
           <w:numId w:val="5"/>
         </w:numPr>
       </w:pPr>
+      <w:proofErr w:type="spellStart"/>
       <w:r>
         <w:t>aircraft.wing.cg.</w:t>
       </w:r>
       <w:r>
-        <w:t>fs     % fuselage station location of the wing cg</w:t>
+        <w:t>fs</w:t>
+      </w:r>
+      <w:proofErr w:type="spellEnd"/>
+      <w:r>
+        <w:t xml:space="preserve">     % fuselage station location of the wing cg</w:t>
       </w:r>
     </w:p>
     <w:p>
@@ -97,8 +109,13 @@
           <w:numId w:val="5"/>
         </w:numPr>
       </w:pPr>
-      <w:r>
-        <w:t xml:space="preserve">aircraft.wing.cg.bl   % butt line </w:t>
+      <w:proofErr w:type="spellStart"/>
+      <w:r>
+        <w:t>aircraft.wing.cg.bl</w:t>
+      </w:r>
+      <w:proofErr w:type="spellEnd"/>
+      <w:r>
+        <w:t xml:space="preserve">   % butt line </w:t>
       </w:r>
       <w:r>
         <w:t>location of the wing cg</w:t>
@@ -112,6 +129,7 @@
           <w:numId w:val="5"/>
         </w:numPr>
       </w:pPr>
+      <w:proofErr w:type="spellStart"/>
       <w:r>
         <w:t>aircraft.wing.</w:t>
       </w:r>
@@ -119,7 +137,11 @@
         <w:t>cg.</w:t>
       </w:r>
       <w:r>
-        <w:t>wl  % water line location of the wing cg</w:t>
+        <w:t>wl</w:t>
+      </w:r>
+      <w:proofErr w:type="spellEnd"/>
+      <w:r>
+        <w:t xml:space="preserve">  % water line location of the wing cg</w:t>
       </w:r>
     </w:p>
     <w:p>
@@ -148,12 +170,14 @@
           <w:numId w:val="5"/>
         </w:numPr>
       </w:pPr>
+      <w:proofErr w:type="spellStart"/>
       <w:r>
         <w:t>aircraft.wing.</w:t>
       </w:r>
       <w:r>
         <w:t>span</w:t>
       </w:r>
+      <w:proofErr w:type="spellEnd"/>
     </w:p>
     <w:p>
       <w:pPr>
@@ -163,8 +187,13 @@
           <w:numId w:val="5"/>
         </w:numPr>
       </w:pPr>
-      <w:r>
-        <w:t xml:space="preserve">aircraft.wing.sweep   % </w:t>
+      <w:proofErr w:type="spellStart"/>
+      <w:r>
+        <w:t>aircraft.wing.sweep</w:t>
+      </w:r>
+      <w:proofErr w:type="spellEnd"/>
+      <w:r>
+        <w:t xml:space="preserve">   % </w:t>
       </w:r>
       <w:r>
         <w:t>wing sweep angle</w:t>
@@ -178,6 +207,7 @@
           <w:numId w:val="5"/>
         </w:numPr>
       </w:pPr>
+      <w:proofErr w:type="spellStart"/>
       <w:r>
         <w:t>aircraft</w:t>
       </w:r>
@@ -187,6 +217,7 @@
       <w:r>
         <w:t>weight</w:t>
       </w:r>
+      <w:proofErr w:type="spellEnd"/>
     </w:p>
     <w:p>
       <w:pPr>
@@ -196,12 +227,49 @@
           <w:numId w:val="5"/>
         </w:numPr>
       </w:pPr>
-      <w:r>
-        <w:t>aircraft.taper_ratio</w:t>
+      <w:proofErr w:type="spellStart"/>
+      <w:r>
+        <w:t>aircraft.</w:t>
+      </w:r>
+      <w:r>
+        <w:t>wing.</w:t>
+      </w:r>
+      <w:r>
+        <w:t>taper_ratio</w:t>
+      </w:r>
+      <w:proofErr w:type="spellEnd"/>
+    </w:p>
+    <w:p>
+      <w:pPr>
+        <w:pStyle w:val="ListParagraph"/>
+        <w:numPr>
+          <w:ilvl w:val="0"/>
+          <w:numId w:val="5"/>
+        </w:numPr>
+      </w:pPr>
+      <w:r>
+        <w:t>aircraft.wing.AR</w:t>
+      </w:r>
+      <w:r>
+        <w:tab/>
+        <w:t>% aspect ratio</w:t>
+      </w:r>
+    </w:p>
+    <w:p>
+      <w:pPr>
+        <w:pStyle w:val="ListParagraph"/>
+        <w:numPr>
+          <w:ilvl w:val="0"/>
+          <w:numId w:val="5"/>
+        </w:numPr>
+      </w:pPr>
+      <w:r>
+        <w:t>aircraft.wing.T2C % thickness to chord ratio</w:t>
       </w:r>
     </w:p>
     <w:p/>
     <w:p>
+      <w:proofErr w:type="spellStart"/>
       <w:r>
         <w:rPr>
           <w:b/>
@@ -210,6 +278,7 @@
         </w:rPr>
         <w:t>aircraft.fuselage</w:t>
       </w:r>
+      <w:proofErr w:type="spellEnd"/>
       <w:r>
         <w:t xml:space="preserve">                 </w:t>
       </w:r>
@@ -222,9 +291,11 @@
           <w:numId w:val="6"/>
         </w:numPr>
       </w:pPr>
+      <w:proofErr w:type="spellStart"/>
       <w:r>
         <w:t>aircraft.fuselage.weight</w:t>
       </w:r>
+      <w:proofErr w:type="spellEnd"/>
     </w:p>
     <w:p>
       <w:pPr>
@@ -234,12 +305,14 @@
           <w:numId w:val="6"/>
         </w:numPr>
       </w:pPr>
+      <w:proofErr w:type="spellStart"/>
       <w:r>
         <w:t>aircraft.fuselage.</w:t>
       </w:r>
       <w:r>
         <w:t>length</w:t>
       </w:r>
+      <w:proofErr w:type="spellEnd"/>
     </w:p>
     <w:p/>
     <w:p>
@@ -277,9 +350,14 @@
           <w:numId w:val="7"/>
         </w:numPr>
       </w:pPr>
-      <w:r>
-        <w:t>aircraft.ht.QuartChordSweep</w:t>
-      </w:r>
+      <w:proofErr w:type="spellStart"/>
+      <w:r>
+        <w:t>aircraft.ht.</w:t>
+      </w:r>
+      <w:r>
+        <w:t>sweep</w:t>
+      </w:r>
+      <w:proofErr w:type="spellEnd"/>
     </w:p>
     <w:p>
       <w:pPr>
@@ -293,7 +371,7 @@
         <w:t>aircraft.ht.</w:t>
       </w:r>
       <w:r>
-        <w:t>AspectRatio</w:t>
+        <w:t>AR</w:t>
       </w:r>
     </w:p>
     <w:p>
@@ -304,12 +382,14 @@
           <w:numId w:val="7"/>
         </w:numPr>
       </w:pPr>
+      <w:proofErr w:type="spellStart"/>
       <w:r>
         <w:t>aircraft.ht.</w:t>
       </w:r>
       <w:r>
         <w:t>TaperRatio</w:t>
       </w:r>
+      <w:proofErr w:type="spellEnd"/>
     </w:p>
     <w:p>
       <w:pPr>
@@ -319,12 +399,14 @@
           <w:numId w:val="7"/>
         </w:numPr>
       </w:pPr>
+      <w:proofErr w:type="spellStart"/>
       <w:r>
         <w:t>aircraft.ht.</w:t>
       </w:r>
       <w:r>
         <w:t>VolCoeff</w:t>
       </w:r>
+      <w:proofErr w:type="spellEnd"/>
     </w:p>
     <w:p>
       <w:pPr>
@@ -349,12 +431,14 @@
           <w:numId w:val="7"/>
         </w:numPr>
       </w:pPr>
+      <w:proofErr w:type="spellStart"/>
       <w:r>
         <w:t>aircraft.ht.</w:t>
       </w:r>
       <w:r>
         <w:t>leverArm</w:t>
       </w:r>
+      <w:proofErr w:type="spellEnd"/>
     </w:p>
     <w:p>
       <w:pPr>
@@ -364,12 +448,14 @@
           <w:numId w:val="7"/>
         </w:numPr>
       </w:pPr>
+      <w:proofErr w:type="spellStart"/>
       <w:r>
         <w:t>aircraft.ht.</w:t>
       </w:r>
       <w:r>
         <w:t>Area</w:t>
       </w:r>
+      <w:proofErr w:type="spellEnd"/>
     </w:p>
     <w:p>
       <w:pPr>
@@ -379,15 +465,18 @@
           <w:numId w:val="7"/>
         </w:numPr>
       </w:pPr>
+      <w:proofErr w:type="spellStart"/>
       <w:r>
         <w:t>aircraft.ht.</w:t>
       </w:r>
       <w:r>
         <w:t>weight</w:t>
       </w:r>
+      <w:proofErr w:type="spellEnd"/>
     </w:p>
     <w:p/>
     <w:p>
+      <w:proofErr w:type="spellStart"/>
       <w:r>
         <w:rPr>
           <w:b/>
@@ -396,6 +485,7 @@
         </w:rPr>
         <w:t>aircraft.vt</w:t>
       </w:r>
+      <w:proofErr w:type="spellEnd"/>
       <w:r>
         <w:t xml:space="preserve">            </w:t>
       </w:r>
@@ -414,7 +504,9 @@
           <w:numId w:val="7"/>
         </w:numPr>
       </w:pPr>
-      <w:r>
+      <w:proofErr w:type="spellStart"/>
+      <w:r>
+        <w:lastRenderedPageBreak/>
         <w:t>aircraft.</w:t>
       </w:r>
       <w:r>
@@ -423,6 +515,7 @@
       <w:r>
         <w:t>t.QuartChordSweep</w:t>
       </w:r>
+      <w:proofErr w:type="spellEnd"/>
     </w:p>
     <w:p>
       <w:pPr>
@@ -439,7 +532,10 @@
         <w:t>v</w:t>
       </w:r>
       <w:r>
-        <w:t>t.AspectRatio</w:t>
+        <w:t>t.</w:t>
+      </w:r>
+      <w:r>
+        <w:t>AR</w:t>
       </w:r>
     </w:p>
     <w:p>
@@ -450,8 +546,8 @@
           <w:numId w:val="7"/>
         </w:numPr>
       </w:pPr>
-      <w:r>
-        <w:lastRenderedPageBreak/>
+      <w:proofErr w:type="spellStart"/>
+      <w:r>
         <w:t>aircraft.</w:t>
       </w:r>
       <w:r>
@@ -460,6 +556,7 @@
       <w:r>
         <w:t>t.TaperRatio</w:t>
       </w:r>
+      <w:proofErr w:type="spellEnd"/>
     </w:p>
     <w:p>
       <w:pPr>
@@ -469,6 +566,7 @@
           <w:numId w:val="7"/>
         </w:numPr>
       </w:pPr>
+      <w:proofErr w:type="spellStart"/>
       <w:r>
         <w:t>aircraft.</w:t>
       </w:r>
@@ -478,6 +576,7 @@
       <w:r>
         <w:t>t.VolCoeff</w:t>
       </w:r>
+      <w:proofErr w:type="spellEnd"/>
     </w:p>
     <w:p>
       <w:pPr>
@@ -505,6 +604,7 @@
           <w:numId w:val="7"/>
         </w:numPr>
       </w:pPr>
+      <w:proofErr w:type="spellStart"/>
       <w:r>
         <w:t>aircraft.</w:t>
       </w:r>
@@ -514,6 +614,7 @@
       <w:r>
         <w:t>t.leverArm</w:t>
       </w:r>
+      <w:proofErr w:type="spellEnd"/>
     </w:p>
     <w:p>
       <w:pPr>
@@ -523,6 +624,7 @@
           <w:numId w:val="7"/>
         </w:numPr>
       </w:pPr>
+      <w:proofErr w:type="spellStart"/>
       <w:r>
         <w:t>aircraft.</w:t>
       </w:r>
@@ -532,6 +634,7 @@
       <w:r>
         <w:t>t.Area</w:t>
       </w:r>
+      <w:proofErr w:type="spellEnd"/>
     </w:p>
     <w:p>
       <w:pPr>
@@ -541,6 +644,7 @@
           <w:numId w:val="7"/>
         </w:numPr>
       </w:pPr>
+      <w:proofErr w:type="spellStart"/>
       <w:r>
         <w:t>aircraft.</w:t>
       </w:r>
@@ -550,6 +654,7 @@
       <w:r>
         <w:t>t.weight</w:t>
       </w:r>
+      <w:proofErr w:type="spellEnd"/>
     </w:p>
     <w:p/>
     <w:p/>
@@ -561,6 +666,7 @@
           <w:u w:val="single"/>
         </w:rPr>
       </w:pPr>
+      <w:proofErr w:type="spellStart"/>
       <w:r>
         <w:rPr>
           <w:b/>
@@ -569,27 +675,58 @@
         </w:rPr>
         <w:t>aircraft.gear</w:t>
       </w:r>
-    </w:p>
-    <w:p>
-      <w:pPr>
+      <w:proofErr w:type="spellEnd"/>
+    </w:p>
+    <w:p>
+      <w:pPr>
+        <w:pStyle w:val="ListParagraph"/>
+        <w:numPr>
+          <w:ilvl w:val="0"/>
+          <w:numId w:val="9"/>
+        </w:numPr>
         <w:rPr>
           <w:b/>
           <w:bCs/>
           <w:u w:val="single"/>
         </w:rPr>
       </w:pPr>
-    </w:p>
-    <w:p>
-      <w:pPr>
+      <w:r>
+        <w:t>aircraft.gear.mg</w:t>
+      </w:r>
+      <w:r>
+        <w:tab/>
+        <w:t>% main gear</w:t>
+      </w:r>
+    </w:p>
+    <w:p>
+      <w:pPr>
+        <w:pStyle w:val="ListParagraph"/>
+        <w:numPr>
+          <w:ilvl w:val="1"/>
+          <w:numId w:val="9"/>
+        </w:numPr>
         <w:rPr>
           <w:b/>
           <w:bCs/>
           <w:u w:val="single"/>
         </w:rPr>
       </w:pPr>
-    </w:p>
-    <w:p>
-      <w:pPr>
+      <w:r>
+        <w:t>.</w:t>
+      </w:r>
+      <w:proofErr w:type="spellStart"/>
+      <w:r>
+        <w:t>mg.weight</w:t>
+      </w:r>
+      <w:proofErr w:type="spellEnd"/>
+    </w:p>
+    <w:p>
+      <w:pPr>
+        <w:pStyle w:val="ListParagraph"/>
+        <w:numPr>
+          <w:ilvl w:val="0"/>
+          <w:numId w:val="9"/>
+        </w:numPr>
         <w:rPr>
           <w:b/>
           <w:bCs/>
@@ -597,13 +734,62 @@
         </w:rPr>
       </w:pPr>
       <w:r>
+        <w:t>aircraft.gear.ng</w:t>
+      </w:r>
+      <w:r>
+        <w:tab/>
+        <w:t>% nose gear</w:t>
+      </w:r>
+    </w:p>
+    <w:p>
+      <w:pPr>
+        <w:pStyle w:val="ListParagraph"/>
+        <w:numPr>
+          <w:ilvl w:val="1"/>
+          <w:numId w:val="9"/>
+        </w:numPr>
         <w:rPr>
           <w:b/>
           <w:bCs/>
           <w:u w:val="single"/>
         </w:rPr>
+      </w:pPr>
+      <w:r>
+        <w:t>.</w:t>
+      </w:r>
+      <w:proofErr w:type="spellStart"/>
+      <w:r>
+        <w:t>ng.weight</w:t>
+      </w:r>
+      <w:proofErr w:type="spellEnd"/>
+    </w:p>
+    <w:p>
+      <w:pPr>
+        <w:rPr>
+          <w:b/>
+          <w:bCs/>
+          <w:u w:val="single"/>
+        </w:rPr>
+      </w:pPr>
+    </w:p>
+    <w:p>
+      <w:pPr>
+        <w:rPr>
+          <w:b/>
+          <w:bCs/>
+          <w:u w:val="single"/>
+        </w:rPr>
+      </w:pPr>
+      <w:proofErr w:type="spellStart"/>
+      <w:r>
+        <w:rPr>
+          <w:b/>
+          <w:bCs/>
+          <w:u w:val="single"/>
+        </w:rPr>
         <w:t>aircraft.cockpit</w:t>
       </w:r>
+      <w:proofErr w:type="spellEnd"/>
     </w:p>
     <w:p>
       <w:pPr>
@@ -631,6 +817,7 @@
           <w:u w:val="single"/>
         </w:rPr>
       </w:pPr>
+      <w:proofErr w:type="spellStart"/>
       <w:r>
         <w:rPr>
           <w:b/>
@@ -639,15 +826,41 @@
         </w:rPr>
         <w:t>aircraft.avionics</w:t>
       </w:r>
-    </w:p>
-    <w:p>
-      <w:pPr>
+      <w:proofErr w:type="spellEnd"/>
+    </w:p>
+    <w:p>
+      <w:pPr>
+        <w:pStyle w:val="ListParagraph"/>
+        <w:numPr>
+          <w:ilvl w:val="0"/>
+          <w:numId w:val="10"/>
+        </w:numPr>
         <w:rPr>
           <w:b/>
           <w:bCs/>
           <w:u w:val="single"/>
         </w:rPr>
       </w:pPr>
+      <w:proofErr w:type="spellStart"/>
+      <w:r>
+        <w:t>aircraft.avionics.weight</w:t>
+      </w:r>
+      <w:proofErr w:type="spellEnd"/>
+      <w:r>
+        <w:t xml:space="preserve"> </w:t>
+      </w:r>
+      <w:r>
+        <w:tab/>
+        <w:t xml:space="preserve">% </w:t>
+      </w:r>
+      <w:proofErr w:type="spellStart"/>
+      <w:r>
+        <w:t>misc</w:t>
+      </w:r>
+      <w:proofErr w:type="spellEnd"/>
+      <w:r>
+        <w:t xml:space="preserve"> 2500 lbs</w:t>
+      </w:r>
     </w:p>
     <w:p>
       <w:pPr>
@@ -666,6 +879,7 @@
           <w:u w:val="single"/>
         </w:rPr>
       </w:pPr>
+      <w:proofErr w:type="spellStart"/>
       <w:r>
         <w:rPr>
           <w:b/>
@@ -674,6 +888,7 @@
         </w:rPr>
         <w:t>aircraft.payload</w:t>
       </w:r>
+      <w:proofErr w:type="spellEnd"/>
     </w:p>
     <w:p>
       <w:pPr>
@@ -683,15 +898,37 @@
           <w:numId w:val="2"/>
         </w:numPr>
       </w:pPr>
+      <w:proofErr w:type="spellStart"/>
       <w:r>
         <w:t>aircraft.</w:t>
       </w:r>
       <w:r>
-        <w:t>strike     % strike payloa</w:t>
+        <w:t>strike</w:t>
+      </w:r>
+      <w:proofErr w:type="spellEnd"/>
+      <w:r>
+        <w:t xml:space="preserve">     % strike payloa</w:t>
       </w:r>
       <w:r>
         <w:t>d</w:t>
       </w:r>
+    </w:p>
+    <w:p>
+      <w:pPr>
+        <w:pStyle w:val="ListParagraph"/>
+        <w:numPr>
+          <w:ilvl w:val="1"/>
+          <w:numId w:val="2"/>
+        </w:numPr>
+      </w:pPr>
+      <w:r>
+        <w:t>.</w:t>
+      </w:r>
+      <w:proofErr w:type="spellStart"/>
+      <w:r>
+        <w:t>strike.weight</w:t>
+      </w:r>
+      <w:proofErr w:type="spellEnd"/>
     </w:p>
     <w:p>
       <w:pPr>
@@ -710,6 +947,18 @@
         <w:t>aircraft.A2A       % air to air combat payload</w:t>
       </w:r>
     </w:p>
+    <w:p>
+      <w:pPr>
+        <w:pStyle w:val="ListParagraph"/>
+        <w:numPr>
+          <w:ilvl w:val="1"/>
+          <w:numId w:val="2"/>
+        </w:numPr>
+      </w:pPr>
+      <w:r>
+        <w:t>.A2A.weight</w:t>
+      </w:r>
+    </w:p>
     <w:p/>
     <w:p>
       <w:r>
@@ -733,13 +982,23 @@
           <w:u w:val="single"/>
         </w:rPr>
       </w:pPr>
+      <w:proofErr w:type="spellStart"/>
       <w:r>
         <w:rPr>
           <w:b/>
           <w:bCs/>
           <w:u w:val="single"/>
         </w:rPr>
-        <w:t xml:space="preserve">aircraft.constants          </w:t>
+        <w:t>aircraft.constants</w:t>
+      </w:r>
+      <w:proofErr w:type="spellEnd"/>
+      <w:r>
+        <w:rPr>
+          <w:b/>
+          <w:bCs/>
+          <w:u w:val="single"/>
+        </w:rPr>
+        <w:t xml:space="preserve">          </w:t>
       </w:r>
     </w:p>
     <w:p>
@@ -753,14 +1012,111 @@
           <w:bCs/>
         </w:rPr>
       </w:pPr>
-      <w:r>
-        <w:rPr>
-          <w:bCs/>
-        </w:rPr>
-        <w:t>aircraft.constants.weight</w:t>
-      </w:r>
-    </w:p>
-    <w:p>
+      <w:proofErr w:type="spellStart"/>
+      <w:r>
+        <w:rPr>
+          <w:bCs/>
+        </w:rPr>
+        <w:t>aircraft.constants.</w:t>
+      </w:r>
+      <w:r>
+        <w:rPr>
+          <w:bCs/>
+        </w:rPr>
+        <w:t>totalWeight</w:t>
+      </w:r>
+      <w:proofErr w:type="spellEnd"/>
+      <w:r>
+        <w:rPr>
+          <w:bCs/>
+        </w:rPr>
+        <w:tab/>
+        <w:t>% total aircraft weight</w:t>
+      </w:r>
+    </w:p>
+    <w:p>
+      <w:pPr>
+        <w:pStyle w:val="ListParagraph"/>
+        <w:numPr>
+          <w:ilvl w:val="0"/>
+          <w:numId w:val="8"/>
+        </w:numPr>
+        <w:rPr>
+          <w:bCs/>
+        </w:rPr>
+      </w:pPr>
+      <w:proofErr w:type="spellStart"/>
+      <w:r>
+        <w:rPr>
+          <w:bCs/>
+        </w:rPr>
+        <w:t>aircraft.constants.fuelWeight</w:t>
+      </w:r>
+      <w:proofErr w:type="spellEnd"/>
+      <w:r>
+        <w:rPr>
+          <w:bCs/>
+        </w:rPr>
+        <w:tab/>
+        <w:t>% fuel weight</w:t>
+      </w:r>
+    </w:p>
+    <w:p>
+      <w:pPr>
+        <w:pStyle w:val="ListParagraph"/>
+        <w:numPr>
+          <w:ilvl w:val="0"/>
+          <w:numId w:val="8"/>
+        </w:numPr>
+        <w:rPr>
+          <w:bCs/>
+        </w:rPr>
+      </w:pPr>
+      <w:proofErr w:type="spellStart"/>
+      <w:r>
+        <w:rPr>
+          <w:bCs/>
+        </w:rPr>
+        <w:t>aircraft.constants.cDP</w:t>
+      </w:r>
+      <w:proofErr w:type="spellEnd"/>
+      <w:r>
+        <w:rPr>
+          <w:bCs/>
+        </w:rPr>
+        <w:tab/>
+        <w:t>% cruise dynamic pressure</w:t>
+      </w:r>
+    </w:p>
+    <w:p>
+      <w:pPr>
+        <w:pStyle w:val="ListParagraph"/>
+        <w:numPr>
+          <w:ilvl w:val="0"/>
+          <w:numId w:val="8"/>
+        </w:numPr>
+        <w:rPr>
+          <w:bCs/>
+        </w:rPr>
+      </w:pPr>
+      <w:proofErr w:type="spellStart"/>
+      <w:r>
+        <w:rPr>
+          <w:bCs/>
+        </w:rPr>
+        <w:t>aircraft.constants.n_ult</w:t>
+      </w:r>
+      <w:proofErr w:type="spellEnd"/>
+      <w:r>
+        <w:rPr>
+          <w:bCs/>
+        </w:rPr>
+        <w:tab/>
+        <w:t>% ultimate load factor</w:t>
+      </w:r>
+    </w:p>
+    <w:p>
+      <w:proofErr w:type="spellStart"/>
       <w:r>
         <w:rPr>
           <w:b/>
@@ -769,6 +1125,7 @@
         </w:rPr>
         <w:t>aircraft.flightcond</w:t>
       </w:r>
+      <w:proofErr w:type="spellEnd"/>
       <w:r>
         <w:rPr>
           <w:b/>
@@ -1023,6 +1380,232 @@
     </w:lvl>
   </w:abstractNum>
   <w:abstractNum w:abstractNumId="2" w15:restartNumberingAfterBreak="0">
+    <w:nsid w:val="16FC6ECC"/>
+    <w:multiLevelType w:val="hybridMultilevel"/>
+    <w:tmpl w:val="C3402230"/>
+    <w:lvl w:ilvl="0" w:tplc="04090001">
+      <w:start w:val="1"/>
+      <w:numFmt w:val="bullet"/>
+      <w:lvlText w:val=""/>
+      <w:lvlJc w:val="left"/>
+      <w:pPr>
+        <w:ind w:left="720" w:hanging="360"/>
+      </w:pPr>
+      <w:rPr>
+        <w:rFonts w:ascii="Symbol" w:hAnsi="Symbol" w:hint="default"/>
+      </w:rPr>
+    </w:lvl>
+    <w:lvl w:ilvl="1" w:tplc="04090003">
+      <w:start w:val="1"/>
+      <w:numFmt w:val="bullet"/>
+      <w:lvlText w:val="o"/>
+      <w:lvlJc w:val="left"/>
+      <w:pPr>
+        <w:ind w:left="1440" w:hanging="360"/>
+      </w:pPr>
+      <w:rPr>
+        <w:rFonts w:ascii="Courier New" w:hAnsi="Courier New" w:cs="Courier New" w:hint="default"/>
+      </w:rPr>
+    </w:lvl>
+    <w:lvl w:ilvl="2" w:tplc="04090005" w:tentative="1">
+      <w:start w:val="1"/>
+      <w:numFmt w:val="bullet"/>
+      <w:lvlText w:val=""/>
+      <w:lvlJc w:val="left"/>
+      <w:pPr>
+        <w:ind w:left="2160" w:hanging="360"/>
+      </w:pPr>
+      <w:rPr>
+        <w:rFonts w:ascii="Wingdings" w:hAnsi="Wingdings" w:hint="default"/>
+      </w:rPr>
+    </w:lvl>
+    <w:lvl w:ilvl="3" w:tplc="04090001" w:tentative="1">
+      <w:start w:val="1"/>
+      <w:numFmt w:val="bullet"/>
+      <w:lvlText w:val=""/>
+      <w:lvlJc w:val="left"/>
+      <w:pPr>
+        <w:ind w:left="2880" w:hanging="360"/>
+      </w:pPr>
+      <w:rPr>
+        <w:rFonts w:ascii="Symbol" w:hAnsi="Symbol" w:hint="default"/>
+      </w:rPr>
+    </w:lvl>
+    <w:lvl w:ilvl="4" w:tplc="04090003" w:tentative="1">
+      <w:start w:val="1"/>
+      <w:numFmt w:val="bullet"/>
+      <w:lvlText w:val="o"/>
+      <w:lvlJc w:val="left"/>
+      <w:pPr>
+        <w:ind w:left="3600" w:hanging="360"/>
+      </w:pPr>
+      <w:rPr>
+        <w:rFonts w:ascii="Courier New" w:hAnsi="Courier New" w:cs="Courier New" w:hint="default"/>
+      </w:rPr>
+    </w:lvl>
+    <w:lvl w:ilvl="5" w:tplc="04090005" w:tentative="1">
+      <w:start w:val="1"/>
+      <w:numFmt w:val="bullet"/>
+      <w:lvlText w:val=""/>
+      <w:lvlJc w:val="left"/>
+      <w:pPr>
+        <w:ind w:left="4320" w:hanging="360"/>
+      </w:pPr>
+      <w:rPr>
+        <w:rFonts w:ascii="Wingdings" w:hAnsi="Wingdings" w:hint="default"/>
+      </w:rPr>
+    </w:lvl>
+    <w:lvl w:ilvl="6" w:tplc="04090001" w:tentative="1">
+      <w:start w:val="1"/>
+      <w:numFmt w:val="bullet"/>
+      <w:lvlText w:val=""/>
+      <w:lvlJc w:val="left"/>
+      <w:pPr>
+        <w:ind w:left="5040" w:hanging="360"/>
+      </w:pPr>
+      <w:rPr>
+        <w:rFonts w:ascii="Symbol" w:hAnsi="Symbol" w:hint="default"/>
+      </w:rPr>
+    </w:lvl>
+    <w:lvl w:ilvl="7" w:tplc="04090003" w:tentative="1">
+      <w:start w:val="1"/>
+      <w:numFmt w:val="bullet"/>
+      <w:lvlText w:val="o"/>
+      <w:lvlJc w:val="left"/>
+      <w:pPr>
+        <w:ind w:left="5760" w:hanging="360"/>
+      </w:pPr>
+      <w:rPr>
+        <w:rFonts w:ascii="Courier New" w:hAnsi="Courier New" w:cs="Courier New" w:hint="default"/>
+      </w:rPr>
+    </w:lvl>
+    <w:lvl w:ilvl="8" w:tplc="04090005" w:tentative="1">
+      <w:start w:val="1"/>
+      <w:numFmt w:val="bullet"/>
+      <w:lvlText w:val=""/>
+      <w:lvlJc w:val="left"/>
+      <w:pPr>
+        <w:ind w:left="6480" w:hanging="360"/>
+      </w:pPr>
+      <w:rPr>
+        <w:rFonts w:ascii="Wingdings" w:hAnsi="Wingdings" w:hint="default"/>
+      </w:rPr>
+    </w:lvl>
+  </w:abstractNum>
+  <w:abstractNum w:abstractNumId="3" w15:restartNumberingAfterBreak="0">
+    <w:nsid w:val="1B857878"/>
+    <w:multiLevelType w:val="hybridMultilevel"/>
+    <w:tmpl w:val="ED7AEEDA"/>
+    <w:lvl w:ilvl="0" w:tplc="04090001">
+      <w:start w:val="1"/>
+      <w:numFmt w:val="bullet"/>
+      <w:lvlText w:val=""/>
+      <w:lvlJc w:val="left"/>
+      <w:pPr>
+        <w:ind w:left="720" w:hanging="360"/>
+      </w:pPr>
+      <w:rPr>
+        <w:rFonts w:ascii="Symbol" w:hAnsi="Symbol" w:hint="default"/>
+      </w:rPr>
+    </w:lvl>
+    <w:lvl w:ilvl="1" w:tplc="04090003" w:tentative="1">
+      <w:start w:val="1"/>
+      <w:numFmt w:val="bullet"/>
+      <w:lvlText w:val="o"/>
+      <w:lvlJc w:val="left"/>
+      <w:pPr>
+        <w:ind w:left="1440" w:hanging="360"/>
+      </w:pPr>
+      <w:rPr>
+        <w:rFonts w:ascii="Courier New" w:hAnsi="Courier New" w:cs="Courier New" w:hint="default"/>
+      </w:rPr>
+    </w:lvl>
+    <w:lvl w:ilvl="2" w:tplc="04090005" w:tentative="1">
+      <w:start w:val="1"/>
+      <w:numFmt w:val="bullet"/>
+      <w:lvlText w:val=""/>
+      <w:lvlJc w:val="left"/>
+      <w:pPr>
+        <w:ind w:left="2160" w:hanging="360"/>
+      </w:pPr>
+      <w:rPr>
+        <w:rFonts w:ascii="Wingdings" w:hAnsi="Wingdings" w:hint="default"/>
+      </w:rPr>
+    </w:lvl>
+    <w:lvl w:ilvl="3" w:tplc="04090001" w:tentative="1">
+      <w:start w:val="1"/>
+      <w:numFmt w:val="bullet"/>
+      <w:lvlText w:val=""/>
+      <w:lvlJc w:val="left"/>
+      <w:pPr>
+        <w:ind w:left="2880" w:hanging="360"/>
+      </w:pPr>
+      <w:rPr>
+        <w:rFonts w:ascii="Symbol" w:hAnsi="Symbol" w:hint="default"/>
+      </w:rPr>
+    </w:lvl>
+    <w:lvl w:ilvl="4" w:tplc="04090003" w:tentative="1">
+      <w:start w:val="1"/>
+      <w:numFmt w:val="bullet"/>
+      <w:lvlText w:val="o"/>
+      <w:lvlJc w:val="left"/>
+      <w:pPr>
+        <w:ind w:left="3600" w:hanging="360"/>
+      </w:pPr>
+      <w:rPr>
+        <w:rFonts w:ascii="Courier New" w:hAnsi="Courier New" w:cs="Courier New" w:hint="default"/>
+      </w:rPr>
+    </w:lvl>
+    <w:lvl w:ilvl="5" w:tplc="04090005" w:tentative="1">
+      <w:start w:val="1"/>
+      <w:numFmt w:val="bullet"/>
+      <w:lvlText w:val=""/>
+      <w:lvlJc w:val="left"/>
+      <w:pPr>
+        <w:ind w:left="4320" w:hanging="360"/>
+      </w:pPr>
+      <w:rPr>
+        <w:rFonts w:ascii="Wingdings" w:hAnsi="Wingdings" w:hint="default"/>
+      </w:rPr>
+    </w:lvl>
+    <w:lvl w:ilvl="6" w:tplc="04090001" w:tentative="1">
+      <w:start w:val="1"/>
+      <w:numFmt w:val="bullet"/>
+      <w:lvlText w:val=""/>
+      <w:lvlJc w:val="left"/>
+      <w:pPr>
+        <w:ind w:left="5040" w:hanging="360"/>
+      </w:pPr>
+      <w:rPr>
+        <w:rFonts w:ascii="Symbol" w:hAnsi="Symbol" w:hint="default"/>
+      </w:rPr>
+    </w:lvl>
+    <w:lvl w:ilvl="7" w:tplc="04090003" w:tentative="1">
+      <w:start w:val="1"/>
+      <w:numFmt w:val="bullet"/>
+      <w:lvlText w:val="o"/>
+      <w:lvlJc w:val="left"/>
+      <w:pPr>
+        <w:ind w:left="5760" w:hanging="360"/>
+      </w:pPr>
+      <w:rPr>
+        <w:rFonts w:ascii="Courier New" w:hAnsi="Courier New" w:cs="Courier New" w:hint="default"/>
+      </w:rPr>
+    </w:lvl>
+    <w:lvl w:ilvl="8" w:tplc="04090005" w:tentative="1">
+      <w:start w:val="1"/>
+      <w:numFmt w:val="bullet"/>
+      <w:lvlText w:val=""/>
+      <w:lvlJc w:val="left"/>
+      <w:pPr>
+        <w:ind w:left="6480" w:hanging="360"/>
+      </w:pPr>
+      <w:rPr>
+        <w:rFonts w:ascii="Wingdings" w:hAnsi="Wingdings" w:hint="default"/>
+      </w:rPr>
+    </w:lvl>
+  </w:abstractNum>
+  <w:abstractNum w:abstractNumId="4" w15:restartNumberingAfterBreak="0">
     <w:nsid w:val="3E87061E"/>
     <w:multiLevelType w:val="hybridMultilevel"/>
     <w:tmpl w:val="9CB2CD76"/>
@@ -1038,7 +1621,7 @@
         <w:rFonts w:ascii="Symbol" w:hAnsi="Symbol" w:hint="default"/>
       </w:rPr>
     </w:lvl>
-    <w:lvl w:ilvl="1" w:tplc="04090003" w:tentative="1">
+    <w:lvl w:ilvl="1" w:tplc="04090003">
       <w:start w:val="1"/>
       <w:numFmt w:val="bullet"/>
       <w:lvlText w:val="o"/>
@@ -1135,7 +1718,7 @@
       </w:rPr>
     </w:lvl>
   </w:abstractNum>
-  <w:abstractNum w:abstractNumId="3" w15:restartNumberingAfterBreak="0">
+  <w:abstractNum w:abstractNumId="5" w15:restartNumberingAfterBreak="0">
     <w:nsid w:val="51F32C0F"/>
     <w:multiLevelType w:val="hybridMultilevel"/>
     <w:tmpl w:val="0AC208CC"/>
@@ -1248,7 +1831,7 @@
       </w:rPr>
     </w:lvl>
   </w:abstractNum>
-  <w:abstractNum w:abstractNumId="4" w15:restartNumberingAfterBreak="0">
+  <w:abstractNum w:abstractNumId="6" w15:restartNumberingAfterBreak="0">
     <w:nsid w:val="6D565BCE"/>
     <w:multiLevelType w:val="hybridMultilevel"/>
     <w:tmpl w:val="8CF03CF0"/>
@@ -1361,7 +1944,7 @@
       </w:rPr>
     </w:lvl>
   </w:abstractNum>
-  <w:abstractNum w:abstractNumId="5" w15:restartNumberingAfterBreak="0">
+  <w:abstractNum w:abstractNumId="7" w15:restartNumberingAfterBreak="0">
     <w:nsid w:val="6DB17FB8"/>
     <w:multiLevelType w:val="hybridMultilevel"/>
     <w:tmpl w:val="12E4354A"/>
@@ -1474,7 +2057,7 @@
       </w:rPr>
     </w:lvl>
   </w:abstractNum>
-  <w:abstractNum w:abstractNumId="6" w15:restartNumberingAfterBreak="0">
+  <w:abstractNum w:abstractNumId="8" w15:restartNumberingAfterBreak="0">
     <w:nsid w:val="74942510"/>
     <w:multiLevelType w:val="hybridMultilevel"/>
     <w:tmpl w:val="18640CBC"/>
@@ -1587,7 +2170,7 @@
       </w:rPr>
     </w:lvl>
   </w:abstractNum>
-  <w:abstractNum w:abstractNumId="7" w15:restartNumberingAfterBreak="0">
+  <w:abstractNum w:abstractNumId="9" w15:restartNumberingAfterBreak="0">
     <w:nsid w:val="76196D61"/>
     <w:multiLevelType w:val="hybridMultilevel"/>
     <w:tmpl w:val="FBA8086E"/>
@@ -1701,10 +2284,10 @@
     </w:lvl>
   </w:abstractNum>
   <w:num w:numId="1" w16cid:durableId="1354958503">
-    <w:abstractNumId w:val="3"/>
+    <w:abstractNumId w:val="5"/>
   </w:num>
   <w:num w:numId="2" w16cid:durableId="441536458">
-    <w:abstractNumId w:val="2"/>
+    <w:abstractNumId w:val="4"/>
   </w:num>
   <w:num w:numId="3" w16cid:durableId="20783843">
     <w:abstractNumId w:val="1"/>
@@ -1713,16 +2296,22 @@
     <w:abstractNumId w:val="0"/>
   </w:num>
   <w:num w:numId="5" w16cid:durableId="817454268">
+    <w:abstractNumId w:val="8"/>
+  </w:num>
+  <w:num w:numId="6" w16cid:durableId="734670056">
     <w:abstractNumId w:val="6"/>
   </w:num>
-  <w:num w:numId="6" w16cid:durableId="734670056">
-    <w:abstractNumId w:val="4"/>
+  <w:num w:numId="7" w16cid:durableId="365250854">
+    <w:abstractNumId w:val="9"/>
   </w:num>
-  <w:num w:numId="7" w16cid:durableId="365250854">
+  <w:num w:numId="8" w16cid:durableId="302396792">
     <w:abstractNumId w:val="7"/>
   </w:num>
-  <w:num w:numId="8" w16cid:durableId="302396792">
-    <w:abstractNumId w:val="5"/>
+  <w:num w:numId="9" w16cid:durableId="2065329463">
+    <w:abstractNumId w:val="2"/>
+  </w:num>
+  <w:num w:numId="10" w16cid:durableId="342826776">
+    <w:abstractNumId w:val="3"/>
   </w:num>
 </w:numbering>
 </file>

</xml_diff>